<commit_message>
docs: correct GA3 report alignment and independency specifications in course handout
</commit_message>
<xml_diff>
--- a/EEE3097_8_9S_2026.docx
+++ b/EEE3097_8_9S_2026.docx
@@ -4933,12 +4933,13 @@
     <w:tbl>
       <w:tblPr>
         <w:tblStyle w:val="Table"/>
-        <w:tblW w:type="pct" w:w="4931"/>
+        <w:tblW w:type="pct" w:w="5000"/>
         <w:tblLayout w:type="fixed"/>
         <w:tblLook w:firstRow="1" w:lastRow="0" w:firstColumn="0" w:lastColumn="0" w:noHBand="0" w:noVBand="0" w:val="0020"/>
       </w:tblPr>
       <w:tblGrid>
         <w:gridCol w:w="7810"/>
+        <w:gridCol w:w="110"/>
       </w:tblGrid>
       <w:tr>
         <w:trPr>
@@ -4977,6 +4978,14 @@
             </w:r>
           </w:p>
         </w:tc>
+        <w:tc>
+          <w:tcPr/>
+          <w:p>
+            <w:pPr>
+              <w:pStyle w:val="Compact"/>
+            </w:pPr>
+          </w:p>
+        </w:tc>
       </w:tr>
       <w:tr>
         <w:tc>
@@ -4996,201 +5005,254 @@
             </w:r>
           </w:p>
         </w:tc>
+        <w:tc>
+          <w:tcPr/>
+          <w:p>
+            <w:pPr>
+              <w:pStyle w:val="Compact"/>
+            </w:pPr>
+          </w:p>
+        </w:tc>
       </w:tr>
       <w:tr>
         <w:tc>
-          <w:tcPr/>
-          <w:p>
-            <w:pPr>
-              <w:pStyle w:val="BodyText"/>
-            </w:pPr>
-            <w:r>
-              <w:t xml:space="preserve">The assessment of Graduate Attribute 3 required for the degree is</w:t>
-            </w:r>
-            <w:r>
-              <w:t xml:space="preserve"> </w:t>
-            </w:r>
-            <w:r>
-              <w:t xml:space="preserve">evaluated in this course. Two design reports, submitted in the</w:t>
-            </w:r>
-            <w:r>
-              <w:t xml:space="preserve"> </w:t>
-            </w:r>
-            <w:r>
-              <w:t xml:space="preserve">format of the EEE3097/8/9S Design Report template, form the primary</w:t>
-            </w:r>
-            <w:r>
-              <w:t xml:space="preserve"> </w:t>
-            </w:r>
-            <w:r>
-              <w:t xml:space="preserve">evidence. Students must demonstrate:</w:t>
-            </w:r>
-          </w:p>
-          <w:p>
-            <w:pPr>
-              <w:numPr>
-                <w:ilvl w:val="0"/>
-                <w:numId w:val="1003"/>
-              </w:numPr>
-            </w:pPr>
-            <w:r>
-              <w:t xml:space="preserve">Brief Description of Design Task: Clarify the subsystem being</w:t>
-            </w:r>
-            <w:r>
-              <w:t xml:space="preserve"> </w:t>
-            </w:r>
-            <w:r>
-              <w:t xml:space="preserve">designed (e.g. motor speed control, ToF wall centering, or</w:t>
-            </w:r>
-            <w:r>
-              <w:t xml:space="preserve"> </w:t>
-            </w:r>
-            <w:r>
-              <w:t xml:space="preserve">Stateflow exploration logic) and its system role.</w:t>
-            </w:r>
-          </w:p>
-          <w:p>
-            <w:pPr>
-              <w:numPr>
-                <w:ilvl w:val="0"/>
-                <w:numId w:val="1003"/>
-              </w:numPr>
-            </w:pPr>
-            <w:r>
-              <w:t xml:space="preserve">Visual Aids (ECSA Criterion 3.3): Integrate block diagrams,</w:t>
-            </w:r>
-            <w:r>
-              <w:t xml:space="preserve"> </w:t>
-            </w:r>
-            <w:r>
-              <w:t xml:space="preserve">Stateflow charts, or Simulink diagrams illustrating the system</w:t>
-            </w:r>
-            <w:r>
-              <w:t xml:space="preserve"> </w:t>
-            </w:r>
-            <w:r>
-              <w:t xml:space="preserve">structure.</w:t>
-            </w:r>
-          </w:p>
-          <w:p>
-            <w:pPr>
-              <w:numPr>
-                <w:ilvl w:val="0"/>
-                <w:numId w:val="1003"/>
-              </w:numPr>
-            </w:pPr>
-            <w:r>
-              <w:t xml:space="preserve">Design Criteria and Constraints (ECSA Criterion 3.1): Define</w:t>
-            </w:r>
-            <w:r>
-              <w:t xml:space="preserve"> </w:t>
-            </w:r>
-            <w:r>
-              <w:t xml:space="preserve">quantitative target performance criteria and system constraints</w:t>
-            </w:r>
-            <w:r>
-              <w:t xml:space="preserve"> </w:t>
-            </w:r>
-            <w:r>
-              <w:t xml:space="preserve">(motor limits, sensor ranges, power budgets).</w:t>
-            </w:r>
-          </w:p>
-          <w:p>
-            <w:pPr>
-              <w:numPr>
-                <w:ilvl w:val="0"/>
-                <w:numId w:val="1003"/>
-              </w:numPr>
-            </w:pPr>
-            <w:r>
-              <w:t xml:space="preserve">Main Design Assumptions with Justification (ECSA Criteria 3.1 &amp;</w:t>
-            </w:r>
-            <w:r>
-              <w:t xml:space="preserve"> </w:t>
-            </w:r>
-            <w:r>
-              <w:t xml:space="preserve">3.3): Document and justify all engineering assumptions (e.g.</w:t>
-            </w:r>
-            <w:r>
-              <w:t xml:space="preserve"> </w:t>
-            </w:r>
-            <w:r>
-              <w:t xml:space="preserve">rigid body, linear motor regions) mathematically.</w:t>
-            </w:r>
-          </w:p>
-          <w:p>
-            <w:pPr>
-              <w:numPr>
-                <w:ilvl w:val="0"/>
-                <w:numId w:val="1003"/>
-              </w:numPr>
-            </w:pPr>
-            <w:r>
-              <w:t xml:space="preserve">Design Process Description (ECSA Criterion 3.2): Document</w:t>
-            </w:r>
-            <w:r>
-              <w:t xml:space="preserve"> </w:t>
-            </w:r>
-            <w:r>
-              <w:t xml:space="preserve">research, concept generation, and the trade-off evaluation of at</w:t>
-            </w:r>
-            <w:r>
-              <w:t xml:space="preserve"> </w:t>
-            </w:r>
-            <w:r>
-              <w:t xml:space="preserve">least two alternative design solutions.</w:t>
-            </w:r>
-          </w:p>
-          <w:p>
-            <w:pPr>
-              <w:numPr>
-                <w:ilvl w:val="0"/>
-                <w:numId w:val="1003"/>
-              </w:numPr>
-            </w:pPr>
-            <w:r>
-              <w:t xml:space="preserve">Design Implementation (ECSA Criterion 3.3): Translate concepts</w:t>
-            </w:r>
-            <w:r>
-              <w:t xml:space="preserve"> </w:t>
-            </w:r>
-            <w:r>
-              <w:t xml:space="preserve">into functional models using first-principles dynamic equations</w:t>
-            </w:r>
-            <w:r>
-              <w:t xml:space="preserve"> </w:t>
-            </w:r>
-            <w:r>
-              <w:t xml:space="preserve">and Simulink architectures or Python script structures.</w:t>
-            </w:r>
-          </w:p>
-          <w:p>
-            <w:pPr>
-              <w:numPr>
-                <w:ilvl w:val="0"/>
-                <w:numId w:val="1003"/>
-              </w:numPr>
-            </w:pPr>
-            <w:r>
-              <w:t xml:space="preserve">Design Evaluation and Testing (ECSA Criteria 3.4 &amp; 3.5): Verify</w:t>
-            </w:r>
-            <w:r>
-              <w:t xml:space="preserve"> </w:t>
-            </w:r>
-            <w:r>
-              <w:t xml:space="preserve">performance in simulation under perturbations (slip, asymmetry)</w:t>
-            </w:r>
-            <w:r>
-              <w:t xml:space="preserve"> </w:t>
-            </w:r>
-            <w:r>
-              <w:t xml:space="preserve">and hardware runs, critically discuss deviations from</w:t>
-            </w:r>
-            <w:r>
-              <w:t xml:space="preserve"> </w:t>
-            </w:r>
-            <w:r>
-              <w:t xml:space="preserve">theoretical models, and document limits and failures.</w:t>
+          <w:tcPr>
+            <w:gridSpan w:val="2"/>
+          </w:tcPr>
+          <w:p>
+            <w:pPr>
+              <w:pStyle w:val="Compact"/>
+            </w:pPr>
+            <w:r>
+              <w:t xml:space="preserve">The assessment of Graduate Attribute 3 required for the degree is |</w:t>
+            </w:r>
+            <w:r>
+              <w:t xml:space="preserve"> </w:t>
+            </w:r>
+            <w:r>
+              <w:t xml:space="preserve">evaluated in this course. Two independent design reports, submitted |</w:t>
+            </w:r>
+            <w:r>
+              <w:t xml:space="preserve"> </w:t>
+            </w:r>
+            <w:r>
+              <w:t xml:space="preserve">in the format of the EEE3097/8/9S Design Report template, form the |</w:t>
+            </w:r>
+            <w:r>
+              <w:t xml:space="preserve"> </w:t>
+            </w:r>
+            <w:r>
+              <w:t xml:space="preserve">primary evidence. The two reports are identical in structure and</w:t>
+            </w:r>
+            <w:r>
+              <w:t xml:space="preserve"> </w:t>
+            </w:r>
+            <w:r>
+              <w:t xml:space="preserve">evaluation criteria, providing separate opportunities to acquire the |</w:t>
+            </w:r>
+            <w:r>
+              <w:t xml:space="preserve"> </w:t>
+            </w:r>
+            <w:r>
+              <w:t xml:space="preserve">same design evidence on different selected subsystems. They are |</w:t>
+            </w:r>
+            <w:r>
+              <w:t xml:space="preserve"> </w:t>
+            </w:r>
+            <w:r>
+              <w:t xml:space="preserve">evaluated independently and are not constrained by, nor related to, |</w:t>
+            </w:r>
+            <w:r>
+              <w:t xml:space="preserve"> </w:t>
+            </w:r>
+            <w:r>
+              <w:t xml:space="preserve">any other practical execution milestones. |</w:t>
+            </w:r>
+            <w:r>
+              <w:t xml:space="preserve"> </w:t>
+            </w:r>
+            <w:r>
+              <w:t xml:space="preserve">|</w:t>
+            </w:r>
+            <w:r>
+              <w:t xml:space="preserve"> </w:t>
+            </w:r>
+            <w:r>
+              <w:t xml:space="preserve">For both reports, students must demonstrate: |</w:t>
+            </w:r>
+            <w:r>
+              <w:t xml:space="preserve"> </w:t>
+            </w:r>
+            <w:r>
+              <w:t xml:space="preserve">|</w:t>
+            </w:r>
+            <w:r>
+              <w:t xml:space="preserve"> </w:t>
+            </w:r>
+            <w:r>
+              <w:t xml:space="preserve">1. Brief Description of Design Task: Clarify the subsystem being |</w:t>
+            </w:r>
+            <w:r>
+              <w:t xml:space="preserve"> </w:t>
+            </w:r>
+            <w:r>
+              <w:t xml:space="preserve">designed (e.g. motor speed control, ToF wall centering, or |</w:t>
+            </w:r>
+            <w:r>
+              <w:t xml:space="preserve"> </w:t>
+            </w:r>
+            <w:r>
+              <w:t xml:space="preserve">Stateflow exploration logic) and its system role. |</w:t>
+            </w:r>
+            <w:r>
+              <w:t xml:space="preserve"> </w:t>
+            </w:r>
+            <w:r>
+              <w:t xml:space="preserve">|</w:t>
+            </w:r>
+            <w:r>
+              <w:t xml:space="preserve"> </w:t>
+            </w:r>
+            <w:r>
+              <w:t xml:space="preserve">2. Visual Aids (ECSA Criterion 3.3): Integrate block diagrams, |</w:t>
+            </w:r>
+            <w:r>
+              <w:t xml:space="preserve"> </w:t>
+            </w:r>
+            <w:r>
+              <w:t xml:space="preserve">Stateflow charts, or Simulink diagrams illustrating the system |</w:t>
+            </w:r>
+            <w:r>
+              <w:t xml:space="preserve"> </w:t>
+            </w:r>
+            <w:r>
+              <w:t xml:space="preserve">structure. |</w:t>
+            </w:r>
+            <w:r>
+              <w:t xml:space="preserve"> </w:t>
+            </w:r>
+            <w:r>
+              <w:t xml:space="preserve">|</w:t>
+            </w:r>
+            <w:r>
+              <w:t xml:space="preserve"> </w:t>
+            </w:r>
+            <w:r>
+              <w:t xml:space="preserve">3. Design Criteria and Constraints (ECSA Criterion 3.1): Define |</w:t>
+            </w:r>
+            <w:r>
+              <w:t xml:space="preserve"> </w:t>
+            </w:r>
+            <w:r>
+              <w:t xml:space="preserve">quantitative target performance criteria and system constraints |</w:t>
+            </w:r>
+            <w:r>
+              <w:t xml:space="preserve"> </w:t>
+            </w:r>
+            <w:r>
+              <w:t xml:space="preserve">(motor limits, sensor ranges, power budgets). |</w:t>
+            </w:r>
+            <w:r>
+              <w:t xml:space="preserve"> </w:t>
+            </w:r>
+            <w:r>
+              <w:t xml:space="preserve">|</w:t>
+            </w:r>
+            <w:r>
+              <w:t xml:space="preserve"> </w:t>
+            </w:r>
+            <w:r>
+              <w:t xml:space="preserve">4. Main Design Assumptions with Justification (ECSA Criteria 3.1 &amp; |</w:t>
+            </w:r>
+            <w:r>
+              <w:t xml:space="preserve"> </w:t>
+            </w:r>
+            <w:r>
+              <w:t xml:space="preserve">3.3): Document and justify all engineering assumptions (e.g. |</w:t>
+            </w:r>
+            <w:r>
+              <w:t xml:space="preserve"> </w:t>
+            </w:r>
+            <w:r>
+              <w:t xml:space="preserve">rigid body, linear motor regions) mathematically. |</w:t>
+            </w:r>
+            <w:r>
+              <w:t xml:space="preserve"> </w:t>
+            </w:r>
+            <w:r>
+              <w:t xml:space="preserve">|</w:t>
+            </w:r>
+            <w:r>
+              <w:t xml:space="preserve"> </w:t>
+            </w:r>
+            <w:r>
+              <w:t xml:space="preserve">5. Design Process Description (ECSA Criterion 3.2): Document |</w:t>
+            </w:r>
+            <w:r>
+              <w:t xml:space="preserve"> </w:t>
+            </w:r>
+            <w:r>
+              <w:t xml:space="preserve">research, concept generation, and the trade-off evaluation of at |</w:t>
+            </w:r>
+            <w:r>
+              <w:t xml:space="preserve"> </w:t>
+            </w:r>
+            <w:r>
+              <w:t xml:space="preserve">least two alternative design solutions. |</w:t>
+            </w:r>
+            <w:r>
+              <w:t xml:space="preserve"> </w:t>
+            </w:r>
+            <w:r>
+              <w:t xml:space="preserve">|</w:t>
+            </w:r>
+            <w:r>
+              <w:t xml:space="preserve"> </w:t>
+            </w:r>
+            <w:r>
+              <w:t xml:space="preserve">6. Design Implementation (ECSA Criterion 3.3): Translate concepts |</w:t>
+            </w:r>
+            <w:r>
+              <w:t xml:space="preserve"> </w:t>
+            </w:r>
+            <w:r>
+              <w:t xml:space="preserve">into functional models using first-principles dynamic equations |</w:t>
+            </w:r>
+            <w:r>
+              <w:t xml:space="preserve"> </w:t>
+            </w:r>
+            <w:r>
+              <w:t xml:space="preserve">and Simulink architectures or Python script structures. |</w:t>
+            </w:r>
+            <w:r>
+              <w:t xml:space="preserve"> </w:t>
+            </w:r>
+            <w:r>
+              <w:t xml:space="preserve">|</w:t>
+            </w:r>
+            <w:r>
+              <w:t xml:space="preserve"> </w:t>
+            </w:r>
+            <w:r>
+              <w:t xml:space="preserve">7. Design Evaluation and Testing (ECSA Criteria 3.4 &amp; 3.5): Verify |</w:t>
+            </w:r>
+            <w:r>
+              <w:t xml:space="preserve"> </w:t>
+            </w:r>
+            <w:r>
+              <w:t xml:space="preserve">performance in simulation under perturbations (slip, asymmetry) |</w:t>
+            </w:r>
+            <w:r>
+              <w:t xml:space="preserve"> </w:t>
+            </w:r>
+            <w:r>
+              <w:t xml:space="preserve">and hardware runs, critically discuss deviations from |</w:t>
+            </w:r>
+            <w:r>
+              <w:t xml:space="preserve"> </w:t>
+            </w:r>
+            <w:r>
+              <w:t xml:space="preserve">theoretical models, and document limits and failures. |</w:t>
             </w:r>
           </w:p>
         </w:tc>
@@ -5213,6 +5275,14 @@
             </w:r>
           </w:p>
         </w:tc>
+        <w:tc>
+          <w:tcPr/>
+          <w:p>
+            <w:pPr>
+              <w:pStyle w:val="Compact"/>
+            </w:pPr>
+          </w:p>
+        </w:tc>
       </w:tr>
       <w:tr>
         <w:tc>
@@ -5234,8 +5304,16 @@
               <w:t xml:space="preserve"> </w:t>
             </w:r>
             <w:r>
-              <w:t xml:space="preserve">of the two milestone reports.</w:t>
-            </w:r>
+              <w:t xml:space="preserve">of the two design reports.</w:t>
+            </w:r>
+          </w:p>
+        </w:tc>
+        <w:tc>
+          <w:tcPr/>
+          <w:p>
+            <w:pPr>
+              <w:pStyle w:val="Compact"/>
+            </w:pPr>
           </w:p>
         </w:tc>
       </w:tr>
@@ -5275,6 +5353,14 @@
             </w:r>
           </w:p>
         </w:tc>
+        <w:tc>
+          <w:tcPr/>
+          <w:p>
+            <w:pPr>
+              <w:pStyle w:val="Compact"/>
+            </w:pPr>
+          </w:p>
+        </w:tc>
       </w:tr>
       <w:tr>
         <w:tc>
@@ -5284,7 +5370,7 @@
               <w:pStyle w:val="Compact"/>
             </w:pPr>
             <w:r>
-              <w:t xml:space="preserve">Graduate attributes will be assessed in both milestone reports. The</w:t>
+              <w:t xml:space="preserve">Graduate attributes will be assessed in both design reports. The</w:t>
             </w:r>
             <w:r>
               <w:t xml:space="preserve"> </w:t>
@@ -5302,14 +5388,28 @@
               <w:t xml:space="preserve"> </w:t>
             </w:r>
             <w:r>
-              <w:t xml:space="preserve">One resubmission of the final report will be permitted (within a</w:t>
-            </w:r>
-            <w:r>
-              <w:t xml:space="preserve"> </w:t>
-            </w:r>
-            <w:r>
-              <w:t xml:space="preserve">limited timeframe) if required.</w:t>
-            </w:r>
+              <w:t xml:space="preserve">One resubmission of a design report will be permitted (within a</w:t>
+            </w:r>
+            <w:r>
+              <w:t xml:space="preserve"> </w:t>
+            </w:r>
+            <w:r>
+              <w:t xml:space="preserve">limited timeframe) if required to demonstrate Graduate Attribute</w:t>
+            </w:r>
+            <w:r>
+              <w:t xml:space="preserve"> </w:t>
+            </w:r>
+            <w:r>
+              <w:t xml:space="preserve">competence.</w:t>
+            </w:r>
+          </w:p>
+        </w:tc>
+        <w:tc>
+          <w:tcPr/>
+          <w:p>
+            <w:pPr>
+              <w:pStyle w:val="Compact"/>
+            </w:pPr>
           </w:p>
         </w:tc>
       </w:tr>
@@ -6937,7 +7037,7 @@
             <w:pPr>
               <w:numPr>
                 <w:ilvl w:val="0"/>
-                <w:numId w:val="1004"/>
+                <w:numId w:val="1003"/>
               </w:numPr>
             </w:pPr>
             <w:r>
@@ -6954,7 +7054,7 @@
             <w:pPr>
               <w:numPr>
                 <w:ilvl w:val="0"/>
-                <w:numId w:val="1004"/>
+                <w:numId w:val="1003"/>
               </w:numPr>
             </w:pPr>
             <w:r>
@@ -6971,7 +7071,7 @@
             <w:pPr>
               <w:numPr>
                 <w:ilvl w:val="0"/>
-                <w:numId w:val="1004"/>
+                <w:numId w:val="1003"/>
               </w:numPr>
             </w:pPr>
             <w:r>
@@ -7028,7 +7128,7 @@
       <w:pPr>
         <w:numPr>
           <w:ilvl w:val="0"/>
-          <w:numId w:val="1005"/>
+          <w:numId w:val="1004"/>
         </w:numPr>
       </w:pPr>
       <w:r>
@@ -7045,7 +7145,7 @@
       <w:pPr>
         <w:numPr>
           <w:ilvl w:val="0"/>
-          <w:numId w:val="1005"/>
+          <w:numId w:val="1004"/>
         </w:numPr>
       </w:pPr>
       <w:r>
@@ -7056,7 +7156,7 @@
       <w:pPr>
         <w:numPr>
           <w:ilvl w:val="0"/>
-          <w:numId w:val="1005"/>
+          <w:numId w:val="1004"/>
         </w:numPr>
       </w:pPr>
       <w:r>
@@ -7397,91 +7497,6 @@
       </w:pPr>
     </w:lvl>
   </w:abstractNum>
-  <w:abstractNum w:abstractNumId="99411">
-    <w:nsid w:val="00A99411"/>
-    <w:multiLevelType w:val="multilevel"/>
-    <w:lvl w:ilvl="0">
-      <w:start w:val="1"/>
-      <w:numFmt w:val="decimal"/>
-      <w:lvlText w:val="%1."/>
-      <w:lvlJc w:val="left"/>
-      <w:pPr>
-        <w:ind w:left="720" w:hanging="360"/>
-      </w:pPr>
-    </w:lvl>
-    <w:lvl w:ilvl="1">
-      <w:start w:val="1"/>
-      <w:numFmt w:val="decimal"/>
-      <w:lvlText w:val="%2."/>
-      <w:lvlJc w:val="left"/>
-      <w:pPr>
-        <w:ind w:left="1440" w:hanging="360"/>
-      </w:pPr>
-    </w:lvl>
-    <w:lvl w:ilvl="2">
-      <w:start w:val="1"/>
-      <w:numFmt w:val="decimal"/>
-      <w:lvlText w:val="%3."/>
-      <w:lvlJc w:val="left"/>
-      <w:pPr>
-        <w:ind w:left="2160" w:hanging="360"/>
-      </w:pPr>
-    </w:lvl>
-    <w:lvl w:ilvl="3">
-      <w:start w:val="1"/>
-      <w:numFmt w:val="decimal"/>
-      <w:lvlText w:val="%4."/>
-      <w:lvlJc w:val="left"/>
-      <w:pPr>
-        <w:ind w:left="2880" w:hanging="360"/>
-      </w:pPr>
-    </w:lvl>
-    <w:lvl w:ilvl="4">
-      <w:start w:val="1"/>
-      <w:numFmt w:val="decimal"/>
-      <w:lvlText w:val="%5."/>
-      <w:lvlJc w:val="left"/>
-      <w:pPr>
-        <w:ind w:left="3600" w:hanging="360"/>
-      </w:pPr>
-    </w:lvl>
-    <w:lvl w:ilvl="5">
-      <w:start w:val="1"/>
-      <w:numFmt w:val="decimal"/>
-      <w:lvlText w:val="%6."/>
-      <w:lvlJc w:val="left"/>
-      <w:pPr>
-        <w:ind w:left="4320" w:hanging="360"/>
-      </w:pPr>
-    </w:lvl>
-    <w:lvl w:ilvl="6">
-      <w:start w:val="1"/>
-      <w:numFmt w:val="decimal"/>
-      <w:lvlText w:val="%7."/>
-      <w:lvlJc w:val="left"/>
-      <w:pPr>
-        <w:ind w:left="5040" w:hanging="360"/>
-      </w:pPr>
-    </w:lvl>
-    <w:lvl w:ilvl="7">
-      <w:start w:val="1"/>
-      <w:numFmt w:val="decimal"/>
-      <w:lvlText w:val="%8."/>
-      <w:lvlJc w:val="left"/>
-      <w:pPr>
-        <w:ind w:left="5760" w:hanging="360"/>
-      </w:pPr>
-    </w:lvl>
-    <w:lvl w:ilvl="8">
-      <w:start w:val="1"/>
-      <w:numFmt w:val="decimal"/>
-      <w:lvlText w:val="%9."/>
-      <w:lvlJc w:val="left"/>
-      <w:pPr>
-        <w:ind w:left="6480" w:hanging="360"/>
-      </w:pPr>
-    </w:lvl>
-  </w:abstractNum>
   <w:abstractNum w:abstractNumId="991">
     <w:nsid w:val="0000A991"/>
     <w:multiLevelType w:val="multilevel"/>
@@ -7649,39 +7664,9 @@
     </w:lvlOverride>
   </w:num>
   <w:num w:numId="1003">
-    <w:abstractNumId w:val="99411"/>
-    <w:lvlOverride w:ilvl="0">
-      <w:startOverride w:val="1"/>
-    </w:lvlOverride>
-    <w:lvlOverride w:ilvl="1">
-      <w:startOverride w:val="1"/>
-    </w:lvlOverride>
-    <w:lvlOverride w:ilvl="2">
-      <w:startOverride w:val="1"/>
-    </w:lvlOverride>
-    <w:lvlOverride w:ilvl="3">
-      <w:startOverride w:val="1"/>
-    </w:lvlOverride>
-    <w:lvlOverride w:ilvl="4">
-      <w:startOverride w:val="1"/>
-    </w:lvlOverride>
-    <w:lvlOverride w:ilvl="5">
-      <w:startOverride w:val="1"/>
-    </w:lvlOverride>
-    <w:lvlOverride w:ilvl="6">
-      <w:startOverride w:val="1"/>
-    </w:lvlOverride>
-    <w:lvlOverride w:ilvl="7">
-      <w:startOverride w:val="1"/>
-    </w:lvlOverride>
-    <w:lvlOverride w:ilvl="8">
-      <w:startOverride w:val="1"/>
-    </w:lvlOverride>
+    <w:abstractNumId w:val="991"/>
   </w:num>
   <w:num w:numId="1004">
-    <w:abstractNumId w:val="991"/>
-  </w:num>
-  <w:num w:numId="1005">
     <w:abstractNumId w:val="991"/>
   </w:num>
 </w:numbering>

</xml_diff>